<commit_message>
Add end-to-end scenarios with handling summary and case closure
New "טיפול עד סגירה" section with three scenarios that the AI drives to a
resolution summary + closed case: arnona discount (autonomous), welfare
request (human decision, AI-managed close), and school registration
(autonomous). Adds a resolution-summary card component; embeds the three
new chat scripts in the spec (MD + DOCX).

Co-Authored-By: Claude Opus 4.8 <noreply@anthropic.com>
Claude-Session: https://claude.ai/code/session_01CFs1x9FtE1n2m4G8ZYWDcW
</commit_message>
<xml_diff>
--- a/docs/AI_Platform_Spec.docx
+++ b/docs/AI_Platform_Spec.docx
@@ -4462,6 +4462,423 @@
     </w:p>
     <w:p>
       <w:pPr>
+        <w:pStyle w:val="Heading2"/>
+        <w:bidi/>
+        <w:jc w:val="right"/>
+      </w:pPr>
+      <w:r>
+        <w:rPr>
+          <w:rFonts w:cs="David" w:ascii="David" w:hAnsi="David"/>
+          <w:rtl w:val="1"/>
+        </w:rPr>
+        <w:t>7.4 טיפול מקצה-לקצה — עד סיכום וסגירת הבקשה</w:t>
+      </w:r>
+    </w:p>
+    <w:p>
+      <w:pPr>
+        <w:bidi/>
+        <w:jc w:val="right"/>
+      </w:pPr>
+      <w:r>
+        <w:rPr>
+          <w:rFonts w:cs="David" w:ascii="David" w:hAnsi="David"/>
+          <w:rtl w:val="1"/>
+        </w:rPr>
+        <w:t xml:space="preserve">מעבר לשלושת תרחישי הדגל, המנוע מטפל בבקשות </w:t>
+      </w:r>
+      <w:r>
+        <w:rPr>
+          <w:rFonts w:cs="David" w:ascii="David" w:hAnsi="David"/>
+          <w:b/>
+          <w:rtl w:val="1"/>
+        </w:rPr>
+        <w:t>עד הסוף</w:t>
+      </w:r>
+      <w:r>
+        <w:rPr>
+          <w:rFonts w:cs="David" w:ascii="David" w:hAnsi="David"/>
+          <w:rtl w:val="1"/>
+        </w:rPr>
+        <w:t xml:space="preserve"> — כולל הפקת </w:t>
+      </w:r>
+      <w:r>
+        <w:rPr>
+          <w:rFonts w:cs="David" w:ascii="David" w:hAnsi="David"/>
+          <w:b/>
+          <w:rtl w:val="1"/>
+        </w:rPr>
+        <w:t>סיכום טיפול וסגירת התיק</w:t>
+      </w:r>
+      <w:r>
+        <w:rPr>
+          <w:rFonts w:cs="David" w:ascii="David" w:hAnsi="David"/>
+          <w:rtl w:val="1"/>
+        </w:rPr>
+        <w:t>. שני מצבי סגירה:</w:t>
+      </w:r>
+    </w:p>
+    <w:p>
+      <w:pPr>
+        <w:pStyle w:val="ListBullet"/>
+        <w:bidi/>
+        <w:jc w:val="right"/>
+      </w:pPr>
+      <w:r>
+        <w:rPr>
+          <w:rFonts w:cs="David" w:ascii="David" w:hAnsi="David"/>
+          <w:b/>
+          <w:rtl w:val="1"/>
+        </w:rPr>
+        <w:t>סגירה אוטומטית</w:t>
+      </w:r>
+      <w:r>
+        <w:rPr>
+          <w:rFonts w:cs="David" w:ascii="David" w:hAnsi="David"/>
+          <w:rtl w:val="1"/>
+        </w:rPr>
+        <w:t xml:space="preserve"> — לבקשות מבוססות-כללים שבהן הזכאות/הפעולה חד-משמעית, הסוכן מבצע, מסכם וסוגר ללא מגע אנושי.</w:t>
+      </w:r>
+    </w:p>
+    <w:p>
+      <w:pPr>
+        <w:pStyle w:val="ListBullet"/>
+        <w:bidi/>
+        <w:jc w:val="right"/>
+      </w:pPr>
+      <w:r>
+        <w:rPr>
+          <w:rFonts w:cs="David" w:ascii="David" w:hAnsi="David"/>
+          <w:b/>
+          <w:rtl w:val="1"/>
+        </w:rPr>
+        <w:t>סגירה בליווי</w:t>
+      </w:r>
+      <w:r>
+        <w:rPr>
+          <w:rFonts w:cs="David" w:ascii="David" w:hAnsi="David"/>
+          <w:rtl w:val="1"/>
+        </w:rPr>
+        <w:t xml:space="preserve"> — לבקשות רגישות, ההחלטה מתקבלת ע"י גורם אנושי מוסמך, אך הסוכן מנהל את כל התהליך, מכין את התיק, מסכם וסוגר ומעדכן את התושב.</w:t>
+      </w:r>
+    </w:p>
+    <w:p>
+      <w:pPr>
+        <w:bidi/>
+        <w:jc w:val="right"/>
+      </w:pPr>
+      <w:r>
+        <w:rPr>
+          <w:rFonts w:cs="David" w:ascii="David" w:hAnsi="David"/>
+          <w:rtl w:val="1"/>
+        </w:rPr>
+        <w:t xml:space="preserve">בכל סגירה מופק </w:t>
+      </w:r>
+      <w:r>
+        <w:rPr>
+          <w:rFonts w:cs="David" w:ascii="David" w:hAnsi="David"/>
+          <w:b/>
+          <w:rtl w:val="1"/>
+        </w:rPr>
+        <w:t>כרטיס סיכום טיפול</w:t>
+      </w:r>
+      <w:r>
+        <w:rPr>
+          <w:rFonts w:cs="David" w:ascii="David" w:hAnsi="David"/>
+          <w:rtl w:val="1"/>
+        </w:rPr>
+        <w:t>: מה בוצע, ההחלטה, זמן הטיפול / עמידה ב-SLA, סוג הסגירה (אוטומטית / אישור אנושי), וסקר שביעות רצון.</w:t>
+      </w:r>
+    </w:p>
+    <w:p>
+      <w:pPr>
+        <w:pStyle w:val="Heading3"/>
+        <w:bidi/>
+        <w:jc w:val="right"/>
+      </w:pPr>
+      <w:r>
+        <w:rPr>
+          <w:rFonts w:cs="David" w:ascii="David" w:hAnsi="David"/>
+          <w:rtl w:val="1"/>
+        </w:rPr>
+        <w:t>7.4.1 הנחה בארנונה — נסגר אוטומטית</w:t>
+      </w:r>
+    </w:p>
+    <w:p>
+      <w:pPr>
+        <w:jc w:val="center"/>
+      </w:pPr>
+      <w:r>
+        <w:drawing>
+          <wp:inline xmlns:a="http://schemas.openxmlformats.org/drawingml/2006/main" xmlns:pic="http://schemas.openxmlformats.org/drawingml/2006/picture">
+            <wp:extent cx="3420000" cy="4023844"/>
+            <wp:docPr id="8" name="Picture 8"/>
+            <wp:cNvGraphicFramePr>
+              <a:graphicFrameLocks noChangeAspect="1"/>
+            </wp:cNvGraphicFramePr>
+            <a:graphic>
+              <a:graphicData uri="http://schemas.openxmlformats.org/drawingml/2006/picture">
+                <pic:pic>
+                  <pic:nvPicPr>
+                    <pic:cNvPr id="0" name="chat_arnona.png"/>
+                    <pic:cNvPicPr/>
+                  </pic:nvPicPr>
+                  <pic:blipFill>
+                    <a:blip r:embed="rId16"/>
+                    <a:stretch>
+                      <a:fillRect/>
+                    </a:stretch>
+                  </pic:blipFill>
+                  <pic:spPr>
+                    <a:xfrm>
+                      <a:off x="0" y="0"/>
+                      <a:ext cx="3420000" cy="4023844"/>
+                    </a:xfrm>
+                    <a:prstGeom prst="rect"/>
+                  </pic:spPr>
+                </pic:pic>
+              </a:graphicData>
+            </a:graphic>
+          </wp:inline>
+        </w:drawing>
+      </w:r>
+    </w:p>
+    <w:p>
+      <w:pPr>
+        <w:bidi/>
+        <w:jc w:val="center"/>
+      </w:pPr>
+      <w:r>
+        <w:rPr>
+          <w:rFonts w:cs="David" w:ascii="David" w:hAnsi="David"/>
+          <w:i/>
+          <w:sz w:val="18"/>
+          <w:rtl w:val="1"/>
+        </w:rPr>
+        <w:t>זיהוי זכאות אוטומטי מתוך תיק 360°, אישור והחלה על החיוב, ואישור לאזור האישי — התיק נסגר אוטומטית עם סיכום טיפול.</w:t>
+      </w:r>
+    </w:p>
+    <w:p>
+      <w:pPr>
+        <w:bidi/>
+        <w:jc w:val="right"/>
+      </w:pPr>
+      <w:r>
+        <w:rPr>
+          <w:rFonts w:cs="David" w:ascii="David" w:hAnsi="David"/>
+          <w:rtl w:val="1"/>
+        </w:rPr>
+        <w:t xml:space="preserve">הסוכן מאמת זהות, שולף את נתוני הזכאות (גיל, גמלה, נכס) דרך Ask-Once, מזהה זכאות להנחת אזרח ותיק, מחיל את ההנחה על החיוב, שולח אישור — </w:t>
+      </w:r>
+      <w:r>
+        <w:rPr>
+          <w:rFonts w:cs="David" w:ascii="David" w:hAnsi="David"/>
+          <w:b/>
+          <w:rtl w:val="1"/>
+        </w:rPr>
+        <w:t>ומפיק סיכום וסוגר את הבקשה</w:t>
+      </w:r>
+      <w:r>
+        <w:rPr>
+          <w:rFonts w:cs="David" w:ascii="David" w:hAnsi="David"/>
+          <w:rtl w:val="1"/>
+        </w:rPr>
+        <w:t xml:space="preserve"> (זמן טיפול: דקות).</w:t>
+      </w:r>
+    </w:p>
+    <w:p>
+      <w:pPr>
+        <w:pStyle w:val="Heading3"/>
+        <w:bidi/>
+        <w:jc w:val="right"/>
+      </w:pPr>
+      <w:r>
+        <w:rPr>
+          <w:rFonts w:cs="David" w:ascii="David" w:hAnsi="David"/>
+          <w:rtl w:val="1"/>
+        </w:rPr>
+        <w:t>7.4.2 בקשת סיוע רווחה — אישור אנושי, ליווי וסגירה ע"י ה-AI</w:t>
+      </w:r>
+    </w:p>
+    <w:p>
+      <w:pPr>
+        <w:jc w:val="center"/>
+      </w:pPr>
+      <w:r>
+        <w:drawing>
+          <wp:inline xmlns:a="http://schemas.openxmlformats.org/drawingml/2006/main" xmlns:pic="http://schemas.openxmlformats.org/drawingml/2006/picture">
+            <wp:extent cx="3420000" cy="4552875"/>
+            <wp:docPr id="9" name="Picture 9"/>
+            <wp:cNvGraphicFramePr>
+              <a:graphicFrameLocks noChangeAspect="1"/>
+            </wp:cNvGraphicFramePr>
+            <a:graphic>
+              <a:graphicData uri="http://schemas.openxmlformats.org/drawingml/2006/picture">
+                <pic:pic>
+                  <pic:nvPicPr>
+                    <pic:cNvPr id="0" name="chat_welfare.png"/>
+                    <pic:cNvPicPr/>
+                  </pic:nvPicPr>
+                  <pic:blipFill>
+                    <a:blip r:embed="rId17"/>
+                    <a:stretch>
+                      <a:fillRect/>
+                    </a:stretch>
+                  </pic:blipFill>
+                  <pic:spPr>
+                    <a:xfrm>
+                      <a:off x="0" y="0"/>
+                      <a:ext cx="3420000" cy="4552875"/>
+                    </a:xfrm>
+                    <a:prstGeom prst="rect"/>
+                  </pic:spPr>
+                </pic:pic>
+              </a:graphicData>
+            </a:graphic>
+          </wp:inline>
+        </w:drawing>
+      </w:r>
+    </w:p>
+    <w:p>
+      <w:pPr>
+        <w:bidi/>
+        <w:jc w:val="center"/>
+      </w:pPr>
+      <w:r>
+        <w:rPr>
+          <w:rFonts w:cs="David" w:ascii="David" w:hAnsi="David"/>
+          <w:i/>
+          <w:sz w:val="18"/>
+          <w:rtl w:val="1"/>
+        </w:rPr>
+        <w:t>הסוכן מזהה דחיפות, מכין את התיק ללא מילוי טפסים (Ask-Once), מתאם פגישת עו"ס — ההחלטה אנושית, אך המערכת מסכמת וסוגרת את התיק.</w:t>
+      </w:r>
+    </w:p>
+    <w:p>
+      <w:pPr>
+        <w:bidi/>
+        <w:jc w:val="right"/>
+      </w:pPr>
+      <w:r>
+        <w:rPr>
+          <w:rFonts w:cs="David" w:ascii="David" w:hAnsi="David"/>
+          <w:rtl w:val="1"/>
+        </w:rPr>
+        <w:t xml:space="preserve">תרחיש רגיש: הסוכן מנהל את התהליך בחיסיון, אוסף את המסמך החסר, מתאם פגישה עם עובד/ת סוציאלי/ת, ולאחר ההחלטה האנושית </w:t>
+      </w:r>
+      <w:r>
+        <w:rPr>
+          <w:rFonts w:cs="David" w:ascii="David" w:hAnsi="David"/>
+          <w:b/>
+          <w:rtl w:val="1"/>
+        </w:rPr>
+        <w:t>מסכם וסוגר</w:t>
+      </w:r>
+      <w:r>
+        <w:rPr>
+          <w:rFonts w:cs="David" w:ascii="David" w:hAnsi="David"/>
+          <w:rtl w:val="1"/>
+        </w:rPr>
+        <w:t xml:space="preserve"> את התיק ומעדכן את התושב. החלטת הסיוע נותרת בידי גורם אנושי מוסמך.</w:t>
+      </w:r>
+    </w:p>
+    <w:p>
+      <w:pPr>
+        <w:pStyle w:val="Heading3"/>
+        <w:bidi/>
+        <w:jc w:val="right"/>
+      </w:pPr>
+      <w:r>
+        <w:rPr>
+          <w:rFonts w:cs="David" w:ascii="David" w:hAnsi="David"/>
+          <w:rtl w:val="1"/>
+        </w:rPr>
+        <w:t>7.4.3 רישום למוסד חינוך — נסגר אוטומטית</w:t>
+      </w:r>
+    </w:p>
+    <w:p>
+      <w:pPr>
+        <w:jc w:val="center"/>
+      </w:pPr>
+      <w:r>
+        <w:drawing>
+          <wp:inline xmlns:a="http://schemas.openxmlformats.org/drawingml/2006/main" xmlns:pic="http://schemas.openxmlformats.org/drawingml/2006/picture">
+            <wp:extent cx="3420000" cy="3788719"/>
+            <wp:docPr id="10" name="Picture 10"/>
+            <wp:cNvGraphicFramePr>
+              <a:graphicFrameLocks noChangeAspect="1"/>
+            </wp:cNvGraphicFramePr>
+            <a:graphic>
+              <a:graphicData uri="http://schemas.openxmlformats.org/drawingml/2006/picture">
+                <pic:pic>
+                  <pic:nvPicPr>
+                    <pic:cNvPr id="0" name="chat_education.png"/>
+                    <pic:cNvPicPr/>
+                  </pic:nvPicPr>
+                  <pic:blipFill>
+                    <a:blip r:embed="rId18"/>
+                    <a:stretch>
+                      <a:fillRect/>
+                    </a:stretch>
+                  </pic:blipFill>
+                  <pic:spPr>
+                    <a:xfrm>
+                      <a:off x="0" y="0"/>
+                      <a:ext cx="3420000" cy="3788719"/>
+                    </a:xfrm>
+                    <a:prstGeom prst="rect"/>
+                  </pic:spPr>
+                </pic:pic>
+              </a:graphicData>
+            </a:graphic>
+          </wp:inline>
+        </w:drawing>
+      </w:r>
+    </w:p>
+    <w:p>
+      <w:pPr>
+        <w:bidi/>
+        <w:jc w:val="center"/>
+      </w:pPr>
+      <w:r>
+        <w:rPr>
+          <w:rFonts w:cs="David" w:ascii="David" w:hAnsi="David"/>
+          <w:i/>
+          <w:sz w:val="18"/>
+          <w:rtl w:val="1"/>
+        </w:rPr>
+        <w:t>זיהוי אזור רישום מ-GIS, בדיקת זמינות מקום בזמן אמת, שיבוץ ואישור — סגירה אוטומטית עם סיכום טיפול.</w:t>
+      </w:r>
+    </w:p>
+    <w:p>
+      <w:pPr>
+        <w:bidi/>
+        <w:jc w:val="right"/>
+      </w:pPr>
+      <w:r>
+        <w:rPr>
+          <w:rFonts w:cs="David" w:ascii="David" w:hAnsi="David"/>
+          <w:rtl w:val="1"/>
+        </w:rPr>
+        <w:t xml:space="preserve">הסוכן מאמת זהות, מזהה את אזור הרישום לפי כתובת (GIS + Ask-Once), בודק זמינות, משבץ לגן, שולח אישור רישום ושיבוץ — </w:t>
+      </w:r>
+      <w:r>
+        <w:rPr>
+          <w:rFonts w:cs="David" w:ascii="David" w:hAnsi="David"/>
+          <w:b/>
+          <w:rtl w:val="1"/>
+        </w:rPr>
+        <w:t>וסוגר את הבקשה אוטומטית</w:t>
+      </w:r>
+      <w:r>
+        <w:rPr>
+          <w:rFonts w:cs="David" w:ascii="David" w:hAnsi="David"/>
+          <w:rtl w:val="1"/>
+        </w:rPr>
+        <w:t xml:space="preserve"> עם סיכום.</w:t>
+      </w:r>
+    </w:p>
+    <w:p>
+      <w:pPr>
         <w:pBdr>
           <w:bottom w:val="single" w:sz="6" w:space="1" w:color="999999"/>
         </w:pBdr>
@@ -4489,7 +4906,7 @@
         <w:drawing>
           <wp:inline xmlns:a="http://schemas.openxmlformats.org/drawingml/2006/main" xmlns:pic="http://schemas.openxmlformats.org/drawingml/2006/picture">
             <wp:extent cx="5400000" cy="1120656"/>
-            <wp:docPr id="8" name="Picture 8"/>
+            <wp:docPr id="11" name="Picture 11"/>
             <wp:cNvGraphicFramePr>
               <a:graphicFrameLocks noChangeAspect="1"/>
             </wp:cNvGraphicFramePr>
@@ -4501,7 +4918,7 @@
                     <pic:cNvPicPr/>
                   </pic:nvPicPr>
                   <pic:blipFill>
-                    <a:blip r:embed="rId16"/>
+                    <a:blip r:embed="rId19"/>
                     <a:stretch>
                       <a:fillRect/>
                     </a:stretch>
@@ -4703,7 +5120,7 @@
         <w:drawing>
           <wp:inline xmlns:a="http://schemas.openxmlformats.org/drawingml/2006/main" xmlns:pic="http://schemas.openxmlformats.org/drawingml/2006/picture">
             <wp:extent cx="5400000" cy="516023"/>
-            <wp:docPr id="9" name="Picture 9"/>
+            <wp:docPr id="12" name="Picture 12"/>
             <wp:cNvGraphicFramePr>
               <a:graphicFrameLocks noChangeAspect="1"/>
             </wp:cNvGraphicFramePr>
@@ -4715,7 +5132,7 @@
                     <pic:cNvPicPr/>
                   </pic:nvPicPr>
                   <pic:blipFill>
-                    <a:blip r:embed="rId17"/>
+                    <a:blip r:embed="rId20"/>
                     <a:stretch>
                       <a:fillRect/>
                     </a:stretch>
@@ -5243,7 +5660,7 @@
         <w:drawing>
           <wp:inline xmlns:a="http://schemas.openxmlformats.org/drawingml/2006/main" xmlns:pic="http://schemas.openxmlformats.org/drawingml/2006/picture">
             <wp:extent cx="3420000" cy="4634201"/>
-            <wp:docPr id="10" name="Picture 10"/>
+            <wp:docPr id="13" name="Picture 13"/>
             <wp:cNvGraphicFramePr>
               <a:graphicFrameLocks noChangeAspect="1"/>
             </wp:cNvGraphicFramePr>
@@ -5255,7 +5672,7 @@
                     <pic:cNvPicPr/>
                   </pic:nvPicPr>
                   <pic:blipFill>
-                    <a:blip r:embed="rId18"/>
+                    <a:blip r:embed="rId21"/>
                     <a:stretch>
                       <a:fillRect/>
                     </a:stretch>
@@ -5718,7 +6135,7 @@
         <w:drawing>
           <wp:inline xmlns:a="http://schemas.openxmlformats.org/drawingml/2006/main" xmlns:pic="http://schemas.openxmlformats.org/drawingml/2006/picture">
             <wp:extent cx="5400000" cy="1501158"/>
-            <wp:docPr id="11" name="Picture 11"/>
+            <wp:docPr id="14" name="Picture 14"/>
             <wp:cNvGraphicFramePr>
               <a:graphicFrameLocks noChangeAspect="1"/>
             </wp:cNvGraphicFramePr>
@@ -5730,7 +6147,7 @@
                     <pic:cNvPicPr/>
                   </pic:nvPicPr>
                   <pic:blipFill>
-                    <a:blip r:embed="rId19"/>
+                    <a:blip r:embed="rId22"/>
                     <a:stretch>
                       <a:fillRect/>
                     </a:stretch>

</xml_diff>